<commit_message>
Add: Lab-3 Socket Programming
</commit_message>
<xml_diff>
--- a/docs/Lab-2.docx
+++ b/docs/Lab-2.docx
@@ -4,11 +4,14 @@
   <w:body>
     <w:p>
       <w:r>
+        <w:rPr>
+          <w:noProof/>
+        </w:rPr>
         <w:drawing>
-          <wp:inline distT="0" distB="0" distL="0" distR="0" wp14:anchorId="1710D9FB" wp14:editId="03CBB962">
-            <wp:extent cx="5731510" cy="2533015"/>
+          <wp:inline distT="0" distB="0" distL="0" distR="0" wp14:anchorId="0F26AB89" wp14:editId="73CB6C48">
+            <wp:extent cx="5867400" cy="2591121"/>
             <wp:effectExtent l="0" t="0" r="0" b="0"/>
-            <wp:docPr id="528254242" name="Picture 1"/>
+            <wp:docPr id="880776653" name="Picture 1"/>
             <wp:cNvGraphicFramePr>
               <a:graphicFrameLocks xmlns:a="http://schemas.openxmlformats.org/drawingml/2006/main" noChangeAspect="1"/>
             </wp:cNvGraphicFramePr>
@@ -16,23 +19,36 @@
               <a:graphicData uri="http://schemas.openxmlformats.org/drawingml/2006/picture">
                 <pic:pic xmlns:pic="http://schemas.openxmlformats.org/drawingml/2006/picture">
                   <pic:nvPicPr>
-                    <pic:cNvPr id="528254242" name=""/>
-                    <pic:cNvPicPr/>
+                    <pic:cNvPr id="0" name="Picture 1"/>
+                    <pic:cNvPicPr>
+                      <a:picLocks noChangeAspect="1" noChangeArrowheads="1"/>
+                    </pic:cNvPicPr>
                   </pic:nvPicPr>
                   <pic:blipFill>
-                    <a:blip r:embed="rId4"/>
+                    <a:blip r:embed="rId4">
+                      <a:extLst>
+                        <a:ext uri="{28A0092B-C50C-407E-A947-70E740481C1C}">
+                          <a14:useLocalDpi xmlns:a14="http://schemas.microsoft.com/office/drawing/2010/main" val="0"/>
+                        </a:ext>
+                      </a:extLst>
+                    </a:blip>
+                    <a:srcRect/>
                     <a:stretch>
                       <a:fillRect/>
                     </a:stretch>
                   </pic:blipFill>
-                  <pic:spPr>
+                  <pic:spPr bwMode="auto">
                     <a:xfrm>
                       <a:off x="0" y="0"/>
-                      <a:ext cx="5731510" cy="2533015"/>
+                      <a:ext cx="5875071" cy="2594508"/>
                     </a:xfrm>
                     <a:prstGeom prst="rect">
                       <a:avLst/>
                     </a:prstGeom>
+                    <a:noFill/>
+                    <a:ln>
+                      <a:noFill/>
+                    </a:ln>
                   </pic:spPr>
                 </pic:pic>
               </a:graphicData>
@@ -47,10 +63,10 @@
           <w:noProof/>
         </w:rPr>
         <w:drawing>
-          <wp:inline distT="0" distB="0" distL="0" distR="0" wp14:anchorId="474A71E6" wp14:editId="34DB2700">
-            <wp:extent cx="5731510" cy="3573780"/>
-            <wp:effectExtent l="0" t="0" r="0" b="0"/>
-            <wp:docPr id="980834706" name="Picture 7"/>
+          <wp:inline distT="0" distB="0" distL="0" distR="0" wp14:anchorId="16AF708B" wp14:editId="07FD0474">
+            <wp:extent cx="5892800" cy="5866640"/>
+            <wp:effectExtent l="0" t="0" r="0" b="1270"/>
+            <wp:docPr id="1643288697" name="Picture 1"/>
             <wp:cNvGraphicFramePr>
               <a:graphicFrameLocks xmlns:a="http://schemas.openxmlformats.org/drawingml/2006/main" noChangeAspect="1"/>
             </wp:cNvGraphicFramePr>
@@ -58,7 +74,7 @@
               <a:graphicData uri="http://schemas.openxmlformats.org/drawingml/2006/picture">
                 <pic:pic xmlns:pic="http://schemas.openxmlformats.org/drawingml/2006/picture">
                   <pic:nvPicPr>
-                    <pic:cNvPr id="0" name="Picture 7"/>
+                    <pic:cNvPr id="0" name="Picture 1"/>
                     <pic:cNvPicPr>
                       <a:picLocks noChangeAspect="1" noChangeArrowheads="1"/>
                     </pic:cNvPicPr>
@@ -79,7 +95,7 @@
                   <pic:spPr bwMode="auto">
                     <a:xfrm>
                       <a:off x="0" y="0"/>
-                      <a:ext cx="5731510" cy="3573780"/>
+                      <a:ext cx="5906291" cy="5880071"/>
                     </a:xfrm>
                     <a:prstGeom prst="rect">
                       <a:avLst/>
@@ -95,15 +111,18 @@
           </wp:inline>
         </w:drawing>
       </w:r>
+    </w:p>
+    <w:p>
       <w:r>
         <w:rPr>
           <w:noProof/>
         </w:rPr>
+        <w:lastRenderedPageBreak/>
         <w:drawing>
-          <wp:inline distT="0" distB="0" distL="0" distR="0" wp14:anchorId="0E0063A4" wp14:editId="36CCC1B6">
-            <wp:extent cx="5731510" cy="1574165"/>
+          <wp:inline distT="0" distB="0" distL="0" distR="0" wp14:anchorId="285D7A56" wp14:editId="6CB01EE8">
+            <wp:extent cx="5723467" cy="5685354"/>
             <wp:effectExtent l="0" t="0" r="0" b="0"/>
-            <wp:docPr id="1553180645" name="Picture 6"/>
+            <wp:docPr id="2062501007" name="Picture 2"/>
             <wp:cNvGraphicFramePr>
               <a:graphicFrameLocks xmlns:a="http://schemas.openxmlformats.org/drawingml/2006/main" noChangeAspect="1"/>
             </wp:cNvGraphicFramePr>
@@ -111,7 +130,7 @@
               <a:graphicData uri="http://schemas.openxmlformats.org/drawingml/2006/picture">
                 <pic:pic xmlns:pic="http://schemas.openxmlformats.org/drawingml/2006/picture">
                   <pic:nvPicPr>
-                    <pic:cNvPr id="0" name="Picture 6"/>
+                    <pic:cNvPr id="0" name="Picture 2"/>
                     <pic:cNvPicPr>
                       <a:picLocks noChangeAspect="1" noChangeArrowheads="1"/>
                     </pic:cNvPicPr>
@@ -132,7 +151,7 @@
                   <pic:spPr bwMode="auto">
                     <a:xfrm>
                       <a:off x="0" y="0"/>
-                      <a:ext cx="5731510" cy="1574165"/>
+                      <a:ext cx="5735554" cy="5697361"/>
                     </a:xfrm>
                     <a:prstGeom prst="rect">
                       <a:avLst/>
@@ -154,10 +173,10 @@
         </w:rPr>
         <w:lastRenderedPageBreak/>
         <w:drawing>
-          <wp:inline distT="0" distB="0" distL="0" distR="0" wp14:anchorId="3FFB5150" wp14:editId="6BF86268">
-            <wp:extent cx="5731510" cy="3479165"/>
-            <wp:effectExtent l="0" t="0" r="0" b="0"/>
-            <wp:docPr id="344115427" name="Picture 5"/>
+          <wp:inline distT="0" distB="0" distL="0" distR="0" wp14:anchorId="7CD55F5C" wp14:editId="383E96A6">
+            <wp:extent cx="5727700" cy="8750300"/>
+            <wp:effectExtent l="0" t="0" r="6350" b="0"/>
+            <wp:docPr id="451493056" name="Picture 3"/>
             <wp:cNvGraphicFramePr>
               <a:graphicFrameLocks xmlns:a="http://schemas.openxmlformats.org/drawingml/2006/main" noChangeAspect="1"/>
             </wp:cNvGraphicFramePr>
@@ -165,7 +184,7 @@
               <a:graphicData uri="http://schemas.openxmlformats.org/drawingml/2006/picture">
                 <pic:pic xmlns:pic="http://schemas.openxmlformats.org/drawingml/2006/picture">
                   <pic:nvPicPr>
-                    <pic:cNvPr id="0" name="Picture 5"/>
+                    <pic:cNvPr id="0" name="Picture 3"/>
                     <pic:cNvPicPr>
                       <a:picLocks noChangeAspect="1" noChangeArrowheads="1"/>
                     </pic:cNvPicPr>
@@ -186,7 +205,7 @@
                   <pic:spPr bwMode="auto">
                     <a:xfrm>
                       <a:off x="0" y="0"/>
-                      <a:ext cx="5731510" cy="3479165"/>
+                      <a:ext cx="5727700" cy="8750300"/>
                     </a:xfrm>
                     <a:prstGeom prst="rect">
                       <a:avLst/>
@@ -206,11 +225,12 @@
         <w:rPr>
           <w:noProof/>
         </w:rPr>
+        <w:lastRenderedPageBreak/>
         <w:drawing>
-          <wp:inline distT="0" distB="0" distL="0" distR="0" wp14:anchorId="276B2F86" wp14:editId="55954BC5">
-            <wp:extent cx="5731510" cy="2760345"/>
-            <wp:effectExtent l="0" t="0" r="0" b="0"/>
-            <wp:docPr id="1172464043" name="Picture 4"/>
+          <wp:inline distT="0" distB="0" distL="0" distR="0" wp14:anchorId="0F24C016" wp14:editId="343AFA20">
+            <wp:extent cx="5727700" cy="8667750"/>
+            <wp:effectExtent l="0" t="0" r="6350" b="0"/>
+            <wp:docPr id="1056343354" name="Picture 4"/>
             <wp:cNvGraphicFramePr>
               <a:graphicFrameLocks xmlns:a="http://schemas.openxmlformats.org/drawingml/2006/main" noChangeAspect="1"/>
             </wp:cNvGraphicFramePr>
@@ -239,60 +259,7 @@
                   <pic:spPr bwMode="auto">
                     <a:xfrm>
                       <a:off x="0" y="0"/>
-                      <a:ext cx="5731510" cy="2760345"/>
-                    </a:xfrm>
-                    <a:prstGeom prst="rect">
-                      <a:avLst/>
-                    </a:prstGeom>
-                    <a:noFill/>
-                    <a:ln>
-                      <a:noFill/>
-                    </a:ln>
-                  </pic:spPr>
-                </pic:pic>
-              </a:graphicData>
-            </a:graphic>
-          </wp:inline>
-        </w:drawing>
-      </w:r>
-      <w:r>
-        <w:rPr>
-          <w:noProof/>
-        </w:rPr>
-        <w:drawing>
-          <wp:inline distT="0" distB="0" distL="0" distR="0" wp14:anchorId="560AE9C4" wp14:editId="1AC7C2BC">
-            <wp:extent cx="5731510" cy="1447800"/>
-            <wp:effectExtent l="0" t="0" r="0" b="0"/>
-            <wp:docPr id="716540096" name="Picture 3"/>
-            <wp:cNvGraphicFramePr>
-              <a:graphicFrameLocks xmlns:a="http://schemas.openxmlformats.org/drawingml/2006/main" noChangeAspect="1"/>
-            </wp:cNvGraphicFramePr>
-            <a:graphic xmlns:a="http://schemas.openxmlformats.org/drawingml/2006/main">
-              <a:graphicData uri="http://schemas.openxmlformats.org/drawingml/2006/picture">
-                <pic:pic xmlns:pic="http://schemas.openxmlformats.org/drawingml/2006/picture">
-                  <pic:nvPicPr>
-                    <pic:cNvPr id="0" name="Picture 3"/>
-                    <pic:cNvPicPr>
-                      <a:picLocks noChangeAspect="1" noChangeArrowheads="1"/>
-                    </pic:cNvPicPr>
-                  </pic:nvPicPr>
-                  <pic:blipFill>
-                    <a:blip r:embed="rId9">
-                      <a:extLst>
-                        <a:ext uri="{28A0092B-C50C-407E-A947-70E740481C1C}">
-                          <a14:useLocalDpi xmlns:a14="http://schemas.microsoft.com/office/drawing/2010/main" val="0"/>
-                        </a:ext>
-                      </a:extLst>
-                    </a:blip>
-                    <a:srcRect/>
-                    <a:stretch>
-                      <a:fillRect/>
-                    </a:stretch>
-                  </pic:blipFill>
-                  <pic:spPr bwMode="auto">
-                    <a:xfrm>
-                      <a:off x="0" y="0"/>
-                      <a:ext cx="5731510" cy="1447800"/>
+                      <a:ext cx="5727700" cy="8667750"/>
                     </a:xfrm>
                     <a:prstGeom prst="rect">
                       <a:avLst/>
@@ -314,10 +281,10 @@
         </w:rPr>
         <w:lastRenderedPageBreak/>
         <w:drawing>
-          <wp:inline distT="0" distB="0" distL="0" distR="0" wp14:anchorId="7BB6E5FB" wp14:editId="7A006B58">
-            <wp:extent cx="5731510" cy="1470025"/>
-            <wp:effectExtent l="0" t="0" r="0" b="0"/>
-            <wp:docPr id="274914978" name="Picture 2"/>
+          <wp:inline distT="0" distB="0" distL="0" distR="0" wp14:anchorId="4C0BA657" wp14:editId="327630B8">
+            <wp:extent cx="5727700" cy="8413750"/>
+            <wp:effectExtent l="0" t="0" r="6350" b="6350"/>
+            <wp:docPr id="1807840179" name="Picture 5"/>
             <wp:cNvGraphicFramePr>
               <a:graphicFrameLocks xmlns:a="http://schemas.openxmlformats.org/drawingml/2006/main" noChangeAspect="1"/>
             </wp:cNvGraphicFramePr>
@@ -325,7 +292,61 @@
               <a:graphicData uri="http://schemas.openxmlformats.org/drawingml/2006/picture">
                 <pic:pic xmlns:pic="http://schemas.openxmlformats.org/drawingml/2006/picture">
                   <pic:nvPicPr>
-                    <pic:cNvPr id="0" name="Picture 2"/>
+                    <pic:cNvPr id="0" name="Picture 5"/>
+                    <pic:cNvPicPr>
+                      <a:picLocks noChangeAspect="1" noChangeArrowheads="1"/>
+                    </pic:cNvPicPr>
+                  </pic:nvPicPr>
+                  <pic:blipFill>
+                    <a:blip r:embed="rId9">
+                      <a:extLst>
+                        <a:ext uri="{28A0092B-C50C-407E-A947-70E740481C1C}">
+                          <a14:useLocalDpi xmlns:a14="http://schemas.microsoft.com/office/drawing/2010/main" val="0"/>
+                        </a:ext>
+                      </a:extLst>
+                    </a:blip>
+                    <a:srcRect/>
+                    <a:stretch>
+                      <a:fillRect/>
+                    </a:stretch>
+                  </pic:blipFill>
+                  <pic:spPr bwMode="auto">
+                    <a:xfrm>
+                      <a:off x="0" y="0"/>
+                      <a:ext cx="5727700" cy="8413750"/>
+                    </a:xfrm>
+                    <a:prstGeom prst="rect">
+                      <a:avLst/>
+                    </a:prstGeom>
+                    <a:noFill/>
+                    <a:ln>
+                      <a:noFill/>
+                    </a:ln>
+                  </pic:spPr>
+                </pic:pic>
+              </a:graphicData>
+            </a:graphic>
+          </wp:inline>
+        </w:drawing>
+      </w:r>
+      <w:r>
+        <w:rPr>
+          <w:noProof/>
+        </w:rPr>
+        <w:lastRenderedPageBreak/>
+        <w:drawing>
+          <wp:inline distT="0" distB="0" distL="0" distR="0" wp14:anchorId="7401B765" wp14:editId="09A6360D">
+            <wp:extent cx="5727700" cy="8509000"/>
+            <wp:effectExtent l="0" t="0" r="6350" b="6350"/>
+            <wp:docPr id="407495416" name="Picture 6"/>
+            <wp:cNvGraphicFramePr>
+              <a:graphicFrameLocks xmlns:a="http://schemas.openxmlformats.org/drawingml/2006/main" noChangeAspect="1"/>
+            </wp:cNvGraphicFramePr>
+            <a:graphic xmlns:a="http://schemas.openxmlformats.org/drawingml/2006/main">
+              <a:graphicData uri="http://schemas.openxmlformats.org/drawingml/2006/picture">
+                <pic:pic xmlns:pic="http://schemas.openxmlformats.org/drawingml/2006/picture">
+                  <pic:nvPicPr>
+                    <pic:cNvPr id="0" name="Picture 6"/>
                     <pic:cNvPicPr>
                       <a:picLocks noChangeAspect="1" noChangeArrowheads="1"/>
                     </pic:cNvPicPr>
@@ -346,60 +367,7 @@
                   <pic:spPr bwMode="auto">
                     <a:xfrm>
                       <a:off x="0" y="0"/>
-                      <a:ext cx="5731510" cy="1470025"/>
-                    </a:xfrm>
-                    <a:prstGeom prst="rect">
-                      <a:avLst/>
-                    </a:prstGeom>
-                    <a:noFill/>
-                    <a:ln>
-                      <a:noFill/>
-                    </a:ln>
-                  </pic:spPr>
-                </pic:pic>
-              </a:graphicData>
-            </a:graphic>
-          </wp:inline>
-        </w:drawing>
-      </w:r>
-      <w:r>
-        <w:rPr>
-          <w:noProof/>
-        </w:rPr>
-        <w:drawing>
-          <wp:inline distT="0" distB="0" distL="0" distR="0" wp14:anchorId="32A1CFF6" wp14:editId="6320D46B">
-            <wp:extent cx="5731510" cy="2047240"/>
-            <wp:effectExtent l="0" t="0" r="0" b="0"/>
-            <wp:docPr id="1093941711" name="Picture 1"/>
-            <wp:cNvGraphicFramePr>
-              <a:graphicFrameLocks xmlns:a="http://schemas.openxmlformats.org/drawingml/2006/main" noChangeAspect="1"/>
-            </wp:cNvGraphicFramePr>
-            <a:graphic xmlns:a="http://schemas.openxmlformats.org/drawingml/2006/main">
-              <a:graphicData uri="http://schemas.openxmlformats.org/drawingml/2006/picture">
-                <pic:pic xmlns:pic="http://schemas.openxmlformats.org/drawingml/2006/picture">
-                  <pic:nvPicPr>
-                    <pic:cNvPr id="0" name="Picture 1"/>
-                    <pic:cNvPicPr>
-                      <a:picLocks noChangeAspect="1" noChangeArrowheads="1"/>
-                    </pic:cNvPicPr>
-                  </pic:nvPicPr>
-                  <pic:blipFill>
-                    <a:blip r:embed="rId11">
-                      <a:extLst>
-                        <a:ext uri="{28A0092B-C50C-407E-A947-70E740481C1C}">
-                          <a14:useLocalDpi xmlns:a14="http://schemas.microsoft.com/office/drawing/2010/main" val="0"/>
-                        </a:ext>
-                      </a:extLst>
-                    </a:blip>
-                    <a:srcRect/>
-                    <a:stretch>
-                      <a:fillRect/>
-                    </a:stretch>
-                  </pic:blipFill>
-                  <pic:spPr bwMode="auto">
-                    <a:xfrm>
-                      <a:off x="0" y="0"/>
-                      <a:ext cx="5731510" cy="2047240"/>
+                      <a:ext cx="5727700" cy="8509000"/>
                     </a:xfrm>
                     <a:prstGeom prst="rect">
                       <a:avLst/>
@@ -416,749 +384,6 @@
         </w:drawing>
       </w:r>
     </w:p>
-    <w:p>
-      <w:r>
-        <w:t>Show IP Routes (Router 0)</w:t>
-      </w:r>
-    </w:p>
-    <w:tbl>
-      <w:tblPr>
-        <w:tblStyle w:val="TableGrid"/>
-        <w:tblW w:w="0" w:type="auto"/>
-        <w:tblLook w:val="04A0" w:firstRow="1" w:lastRow="0" w:firstColumn="1" w:lastColumn="0" w:noHBand="0" w:noVBand="1"/>
-      </w:tblPr>
-      <w:tblGrid>
-        <w:gridCol w:w="9242"/>
-      </w:tblGrid>
-      <w:tr>
-        <w:tc>
-          <w:tcPr>
-            <w:tcW w:w="9242" w:type="dxa"/>
-          </w:tcPr>
-          <w:p>
-            <w:pPr>
-              <w:rPr>
-                <w:rFonts w:ascii="Monospace" w:hAnsi="Monospace"/>
-                <w:sz w:val="20"/>
-                <w:szCs w:val="24"/>
-              </w:rPr>
-            </w:pPr>
-            <w:proofErr w:type="spellStart"/>
-            <w:r>
-              <w:rPr>
-                <w:rFonts w:ascii="Monospace" w:hAnsi="Monospace"/>
-                <w:sz w:val="20"/>
-                <w:szCs w:val="24"/>
-              </w:rPr>
-              <w:t>Router#show</w:t>
-            </w:r>
-            <w:proofErr w:type="spellEnd"/>
-            <w:r>
-              <w:rPr>
-                <w:rFonts w:ascii="Monospace" w:hAnsi="Monospace"/>
-                <w:sz w:val="20"/>
-                <w:szCs w:val="24"/>
-              </w:rPr>
-              <w:t xml:space="preserve"> </w:t>
-            </w:r>
-            <w:proofErr w:type="spellStart"/>
-            <w:r>
-              <w:rPr>
-                <w:rFonts w:ascii="Monospace" w:hAnsi="Monospace"/>
-                <w:sz w:val="20"/>
-                <w:szCs w:val="24"/>
-              </w:rPr>
-              <w:t>ip</w:t>
-            </w:r>
-            <w:proofErr w:type="spellEnd"/>
-            <w:r>
-              <w:rPr>
-                <w:rFonts w:ascii="Monospace" w:hAnsi="Monospace"/>
-                <w:sz w:val="20"/>
-                <w:szCs w:val="24"/>
-              </w:rPr>
-              <w:t xml:space="preserve"> route</w:t>
-            </w:r>
-          </w:p>
-          <w:p>
-            <w:pPr>
-              <w:rPr>
-                <w:rFonts w:ascii="Monospace" w:hAnsi="Monospace"/>
-                <w:sz w:val="20"/>
-                <w:szCs w:val="24"/>
-              </w:rPr>
-            </w:pPr>
-            <w:r>
-              <w:rPr>
-                <w:rFonts w:ascii="Monospace" w:hAnsi="Monospace"/>
-                <w:sz w:val="20"/>
-                <w:szCs w:val="24"/>
-              </w:rPr>
-              <w:t xml:space="preserve">    </w:t>
-            </w:r>
-            <w:r>
-              <w:rPr>
-                <w:rFonts w:ascii="Monospace" w:hAnsi="Monospace"/>
-                <w:sz w:val="20"/>
-                <w:szCs w:val="24"/>
-              </w:rPr>
-              <w:t>Codes: C - connected, S - static, I - IGRP, R - RIP, M - mobile, B - BGP</w:t>
-            </w:r>
-          </w:p>
-          <w:p>
-            <w:pPr>
-              <w:rPr>
-                <w:rFonts w:ascii="Monospace" w:hAnsi="Monospace"/>
-                <w:sz w:val="20"/>
-                <w:szCs w:val="24"/>
-              </w:rPr>
-            </w:pPr>
-            <w:r>
-              <w:rPr>
-                <w:rFonts w:ascii="Monospace" w:hAnsi="Monospace"/>
-                <w:sz w:val="20"/>
-                <w:szCs w:val="24"/>
-              </w:rPr>
-              <w:t xml:space="preserve">    </w:t>
-            </w:r>
-            <w:r>
-              <w:rPr>
-                <w:rFonts w:ascii="Monospace" w:hAnsi="Monospace"/>
-                <w:sz w:val="20"/>
-                <w:szCs w:val="24"/>
-              </w:rPr>
-              <w:t>D - EIGRP, EX - EIGRP external, O - OSPF, IA - OSPF inter area</w:t>
-            </w:r>
-          </w:p>
-          <w:p>
-            <w:pPr>
-              <w:rPr>
-                <w:rFonts w:ascii="Monospace" w:hAnsi="Monospace"/>
-                <w:sz w:val="20"/>
-                <w:szCs w:val="24"/>
-              </w:rPr>
-            </w:pPr>
-            <w:r>
-              <w:rPr>
-                <w:rFonts w:ascii="Monospace" w:hAnsi="Monospace"/>
-                <w:sz w:val="20"/>
-                <w:szCs w:val="24"/>
-              </w:rPr>
-              <w:t xml:space="preserve">    </w:t>
-            </w:r>
-            <w:r>
-              <w:rPr>
-                <w:rFonts w:ascii="Monospace" w:hAnsi="Monospace"/>
-                <w:sz w:val="20"/>
-                <w:szCs w:val="24"/>
-              </w:rPr>
-              <w:t>N1 - OSPF NSSA external type 1, N2 - OSPF NSSA external type 2</w:t>
-            </w:r>
-          </w:p>
-          <w:p>
-            <w:pPr>
-              <w:rPr>
-                <w:rFonts w:ascii="Monospace" w:hAnsi="Monospace"/>
-                <w:sz w:val="20"/>
-                <w:szCs w:val="24"/>
-              </w:rPr>
-            </w:pPr>
-            <w:r>
-              <w:rPr>
-                <w:rFonts w:ascii="Monospace" w:hAnsi="Monospace"/>
-                <w:sz w:val="20"/>
-                <w:szCs w:val="24"/>
-              </w:rPr>
-              <w:t xml:space="preserve">    </w:t>
-            </w:r>
-            <w:r>
-              <w:rPr>
-                <w:rFonts w:ascii="Monospace" w:hAnsi="Monospace"/>
-                <w:sz w:val="20"/>
-                <w:szCs w:val="24"/>
-              </w:rPr>
-              <w:t>E1 - OSPF external type 1, E2 - OSPF external type 2, E - EGP</w:t>
-            </w:r>
-          </w:p>
-          <w:p>
-            <w:pPr>
-              <w:rPr>
-                <w:rFonts w:ascii="Monospace" w:hAnsi="Monospace"/>
-                <w:sz w:val="20"/>
-                <w:szCs w:val="24"/>
-              </w:rPr>
-            </w:pPr>
-            <w:r>
-              <w:rPr>
-                <w:rFonts w:ascii="Monospace" w:hAnsi="Monospace"/>
-                <w:sz w:val="20"/>
-                <w:szCs w:val="24"/>
-              </w:rPr>
-              <w:t xml:space="preserve">    </w:t>
-            </w:r>
-            <w:r>
-              <w:rPr>
-                <w:rFonts w:ascii="Monospace" w:hAnsi="Monospace"/>
-                <w:sz w:val="20"/>
-                <w:szCs w:val="24"/>
-              </w:rPr>
-              <w:t xml:space="preserve">i - IS-IS, L1 - IS-IS level-1, L2 - IS-IS level-2, </w:t>
-            </w:r>
-            <w:proofErr w:type="spellStart"/>
-            <w:r>
-              <w:rPr>
-                <w:rFonts w:ascii="Monospace" w:hAnsi="Monospace"/>
-                <w:sz w:val="20"/>
-                <w:szCs w:val="24"/>
-              </w:rPr>
-              <w:t>ia</w:t>
-            </w:r>
-            <w:proofErr w:type="spellEnd"/>
-            <w:r>
-              <w:rPr>
-                <w:rFonts w:ascii="Monospace" w:hAnsi="Monospace"/>
-                <w:sz w:val="20"/>
-                <w:szCs w:val="24"/>
-              </w:rPr>
-              <w:t xml:space="preserve"> - IS-IS inter area</w:t>
-            </w:r>
-          </w:p>
-          <w:p>
-            <w:pPr>
-              <w:rPr>
-                <w:rFonts w:ascii="Monospace" w:hAnsi="Monospace"/>
-                <w:sz w:val="20"/>
-                <w:szCs w:val="24"/>
-              </w:rPr>
-            </w:pPr>
-            <w:r>
-              <w:rPr>
-                <w:rFonts w:ascii="Monospace" w:hAnsi="Monospace"/>
-                <w:sz w:val="20"/>
-                <w:szCs w:val="24"/>
-              </w:rPr>
-              <w:t xml:space="preserve">    </w:t>
-            </w:r>
-            <w:r>
-              <w:rPr>
-                <w:rFonts w:ascii="Monospace" w:hAnsi="Monospace"/>
-                <w:sz w:val="20"/>
-                <w:szCs w:val="24"/>
-              </w:rPr>
-              <w:t>* - candidate default, U - per-user static route, o - ODR</w:t>
-            </w:r>
-          </w:p>
-          <w:p>
-            <w:pPr>
-              <w:rPr>
-                <w:rFonts w:ascii="Monospace" w:hAnsi="Monospace"/>
-                <w:sz w:val="20"/>
-                <w:szCs w:val="24"/>
-              </w:rPr>
-            </w:pPr>
-            <w:r>
-              <w:rPr>
-                <w:rFonts w:ascii="Monospace" w:hAnsi="Monospace"/>
-                <w:sz w:val="20"/>
-                <w:szCs w:val="24"/>
-              </w:rPr>
-              <w:t xml:space="preserve">    </w:t>
-            </w:r>
-            <w:r>
-              <w:rPr>
-                <w:rFonts w:ascii="Monospace" w:hAnsi="Monospace"/>
-                <w:sz w:val="20"/>
-                <w:szCs w:val="24"/>
-              </w:rPr>
-              <w:t>P - periodic downloaded static route</w:t>
-            </w:r>
-          </w:p>
-          <w:p>
-            <w:pPr>
-              <w:rPr>
-                <w:rFonts w:ascii="Monospace" w:hAnsi="Monospace"/>
-                <w:sz w:val="20"/>
-                <w:szCs w:val="24"/>
-              </w:rPr>
-            </w:pPr>
-            <w:r>
-              <w:rPr>
-                <w:rFonts w:ascii="Monospace" w:hAnsi="Monospace"/>
-                <w:sz w:val="20"/>
-                <w:szCs w:val="24"/>
-              </w:rPr>
-              <w:t xml:space="preserve">    </w:t>
-            </w:r>
-            <w:r>
-              <w:rPr>
-                <w:rFonts w:ascii="Monospace" w:hAnsi="Monospace"/>
-                <w:sz w:val="20"/>
-                <w:szCs w:val="24"/>
-              </w:rPr>
-              <w:t>Gateway of last resort is not set</w:t>
-            </w:r>
-          </w:p>
-          <w:p>
-            <w:pPr>
-              <w:rPr>
-                <w:rFonts w:ascii="Monospace" w:hAnsi="Monospace"/>
-                <w:sz w:val="20"/>
-                <w:szCs w:val="24"/>
-              </w:rPr>
-            </w:pPr>
-            <w:r>
-              <w:rPr>
-                <w:rFonts w:ascii="Monospace" w:hAnsi="Monospace"/>
-                <w:sz w:val="20"/>
-                <w:szCs w:val="24"/>
-              </w:rPr>
-              <w:t xml:space="preserve">    </w:t>
-            </w:r>
-            <w:r>
-              <w:rPr>
-                <w:rFonts w:ascii="Monospace" w:hAnsi="Monospace"/>
-                <w:sz w:val="20"/>
-                <w:szCs w:val="24"/>
-              </w:rPr>
-              <w:t>S 60.0.0.0/8 [1/0] via 192.162.10.2</w:t>
-            </w:r>
-          </w:p>
-          <w:p>
-            <w:pPr>
-              <w:rPr>
-                <w:rFonts w:ascii="Monospace" w:hAnsi="Monospace"/>
-                <w:sz w:val="20"/>
-                <w:szCs w:val="24"/>
-              </w:rPr>
-            </w:pPr>
-            <w:r>
-              <w:rPr>
-                <w:rFonts w:ascii="Monospace" w:hAnsi="Monospace"/>
-                <w:sz w:val="20"/>
-                <w:szCs w:val="24"/>
-              </w:rPr>
-              <w:t xml:space="preserve">    </w:t>
-            </w:r>
-            <w:r>
-              <w:rPr>
-                <w:rFonts w:ascii="Monospace" w:hAnsi="Monospace"/>
-                <w:sz w:val="20"/>
-                <w:szCs w:val="24"/>
-              </w:rPr>
-              <w:t>C 192.162.10.0/24 is directly connected, Serial2/0</w:t>
-            </w:r>
-          </w:p>
-        </w:tc>
-      </w:tr>
-    </w:tbl>
-    <w:p/>
-    <w:p>
-      <w:r>
-        <w:t>Show IP Routes (Router 1)</w:t>
-      </w:r>
-    </w:p>
-    <w:tbl>
-      <w:tblPr>
-        <w:tblStyle w:val="TableGrid"/>
-        <w:tblW w:w="0" w:type="auto"/>
-        <w:tblLook w:val="04A0" w:firstRow="1" w:lastRow="0" w:firstColumn="1" w:lastColumn="0" w:noHBand="0" w:noVBand="1"/>
-      </w:tblPr>
-      <w:tblGrid>
-        <w:gridCol w:w="9242"/>
-      </w:tblGrid>
-      <w:tr>
-        <w:tc>
-          <w:tcPr>
-            <w:tcW w:w="9242" w:type="dxa"/>
-          </w:tcPr>
-          <w:p>
-            <w:pPr>
-              <w:rPr>
-                <w:rFonts w:ascii="Monospace" w:hAnsi="Monospace"/>
-                <w:sz w:val="20"/>
-                <w:szCs w:val="24"/>
-              </w:rPr>
-            </w:pPr>
-            <w:proofErr w:type="spellStart"/>
-            <w:r>
-              <w:rPr>
-                <w:rFonts w:ascii="Monospace" w:hAnsi="Monospace"/>
-                <w:sz w:val="20"/>
-                <w:szCs w:val="24"/>
-              </w:rPr>
-              <w:t>Router#show</w:t>
-            </w:r>
-            <w:proofErr w:type="spellEnd"/>
-            <w:r>
-              <w:rPr>
-                <w:rFonts w:ascii="Monospace" w:hAnsi="Monospace"/>
-                <w:sz w:val="20"/>
-                <w:szCs w:val="24"/>
-              </w:rPr>
-              <w:t xml:space="preserve"> </w:t>
-            </w:r>
-            <w:proofErr w:type="spellStart"/>
-            <w:r>
-              <w:rPr>
-                <w:rFonts w:ascii="Monospace" w:hAnsi="Monospace"/>
-                <w:sz w:val="20"/>
-                <w:szCs w:val="24"/>
-              </w:rPr>
-              <w:t>ip</w:t>
-            </w:r>
-            <w:proofErr w:type="spellEnd"/>
-            <w:r>
-              <w:rPr>
-                <w:rFonts w:ascii="Monospace" w:hAnsi="Monospace"/>
-                <w:sz w:val="20"/>
-                <w:szCs w:val="24"/>
-              </w:rPr>
-              <w:t xml:space="preserve"> route</w:t>
-            </w:r>
-          </w:p>
-          <w:p>
-            <w:pPr>
-              <w:rPr>
-                <w:rFonts w:ascii="Monospace" w:hAnsi="Monospace"/>
-                <w:sz w:val="20"/>
-                <w:szCs w:val="24"/>
-              </w:rPr>
-            </w:pPr>
-            <w:r>
-              <w:rPr>
-                <w:rFonts w:ascii="Monospace" w:hAnsi="Monospace"/>
-                <w:sz w:val="20"/>
-                <w:szCs w:val="24"/>
-              </w:rPr>
-              <w:t xml:space="preserve">    </w:t>
-            </w:r>
-            <w:r>
-              <w:rPr>
-                <w:rFonts w:ascii="Monospace" w:hAnsi="Monospace"/>
-                <w:sz w:val="20"/>
-                <w:szCs w:val="24"/>
-              </w:rPr>
-              <w:t>Codes: C - connected, S - static, I - IGRP, R - RIP, M - mobile, B - BGP</w:t>
-            </w:r>
-          </w:p>
-          <w:p>
-            <w:pPr>
-              <w:rPr>
-                <w:rFonts w:ascii="Monospace" w:hAnsi="Monospace"/>
-                <w:sz w:val="20"/>
-                <w:szCs w:val="24"/>
-              </w:rPr>
-            </w:pPr>
-            <w:r>
-              <w:rPr>
-                <w:rFonts w:ascii="Monospace" w:hAnsi="Monospace"/>
-                <w:sz w:val="20"/>
-                <w:szCs w:val="24"/>
-              </w:rPr>
-              <w:t xml:space="preserve">    </w:t>
-            </w:r>
-            <w:r>
-              <w:rPr>
-                <w:rFonts w:ascii="Monospace" w:hAnsi="Monospace"/>
-                <w:sz w:val="20"/>
-                <w:szCs w:val="24"/>
-              </w:rPr>
-              <w:t>D - EIGRP, EX - EIGRP external, O - OSPF, IA - OSPF inter area</w:t>
-            </w:r>
-          </w:p>
-          <w:p>
-            <w:pPr>
-              <w:rPr>
-                <w:rFonts w:ascii="Monospace" w:hAnsi="Monospace"/>
-                <w:sz w:val="20"/>
-                <w:szCs w:val="24"/>
-              </w:rPr>
-            </w:pPr>
-            <w:r>
-              <w:rPr>
-                <w:rFonts w:ascii="Monospace" w:hAnsi="Monospace"/>
-                <w:sz w:val="20"/>
-                <w:szCs w:val="24"/>
-              </w:rPr>
-              <w:t xml:space="preserve">    </w:t>
-            </w:r>
-            <w:r>
-              <w:rPr>
-                <w:rFonts w:ascii="Monospace" w:hAnsi="Monospace"/>
-                <w:sz w:val="20"/>
-                <w:szCs w:val="24"/>
-              </w:rPr>
-              <w:t>N1 - OSPF NSSA external type 1, N2 - OSPF NSSA external type 2</w:t>
-            </w:r>
-          </w:p>
-          <w:p>
-            <w:pPr>
-              <w:rPr>
-                <w:rFonts w:ascii="Monospace" w:hAnsi="Monospace"/>
-                <w:sz w:val="20"/>
-                <w:szCs w:val="24"/>
-              </w:rPr>
-            </w:pPr>
-            <w:r>
-              <w:rPr>
-                <w:rFonts w:ascii="Monospace" w:hAnsi="Monospace"/>
-                <w:sz w:val="20"/>
-                <w:szCs w:val="24"/>
-              </w:rPr>
-              <w:t xml:space="preserve">    </w:t>
-            </w:r>
-            <w:r>
-              <w:rPr>
-                <w:rFonts w:ascii="Monospace" w:hAnsi="Monospace"/>
-                <w:sz w:val="20"/>
-                <w:szCs w:val="24"/>
-              </w:rPr>
-              <w:t>E1 - OSPF external type 1, E2 - OSPF external type 2, E - EGP</w:t>
-            </w:r>
-          </w:p>
-          <w:p>
-            <w:pPr>
-              <w:rPr>
-                <w:rFonts w:ascii="Monospace" w:hAnsi="Monospace"/>
-                <w:sz w:val="20"/>
-                <w:szCs w:val="24"/>
-              </w:rPr>
-            </w:pPr>
-            <w:r>
-              <w:rPr>
-                <w:rFonts w:ascii="Monospace" w:hAnsi="Monospace"/>
-                <w:sz w:val="20"/>
-                <w:szCs w:val="24"/>
-              </w:rPr>
-              <w:t xml:space="preserve">    </w:t>
-            </w:r>
-            <w:r>
-              <w:rPr>
-                <w:rFonts w:ascii="Monospace" w:hAnsi="Monospace"/>
-                <w:sz w:val="20"/>
-                <w:szCs w:val="24"/>
-              </w:rPr>
-              <w:t xml:space="preserve">i - IS-IS, L1 - IS-IS level-1, L2 - IS-IS level-2, </w:t>
-            </w:r>
-            <w:proofErr w:type="spellStart"/>
-            <w:r>
-              <w:rPr>
-                <w:rFonts w:ascii="Monospace" w:hAnsi="Monospace"/>
-                <w:sz w:val="20"/>
-                <w:szCs w:val="24"/>
-              </w:rPr>
-              <w:t>ia</w:t>
-            </w:r>
-            <w:proofErr w:type="spellEnd"/>
-            <w:r>
-              <w:rPr>
-                <w:rFonts w:ascii="Monospace" w:hAnsi="Monospace"/>
-                <w:sz w:val="20"/>
-                <w:szCs w:val="24"/>
-              </w:rPr>
-              <w:t xml:space="preserve"> - IS-IS inter area</w:t>
-            </w:r>
-          </w:p>
-          <w:p>
-            <w:pPr>
-              <w:rPr>
-                <w:rFonts w:ascii="Monospace" w:hAnsi="Monospace"/>
-                <w:sz w:val="20"/>
-                <w:szCs w:val="24"/>
-              </w:rPr>
-            </w:pPr>
-            <w:r>
-              <w:rPr>
-                <w:rFonts w:ascii="Monospace" w:hAnsi="Monospace"/>
-                <w:sz w:val="20"/>
-                <w:szCs w:val="24"/>
-              </w:rPr>
-              <w:t xml:space="preserve">    </w:t>
-            </w:r>
-            <w:r>
-              <w:rPr>
-                <w:rFonts w:ascii="Monospace" w:hAnsi="Monospace"/>
-                <w:sz w:val="20"/>
-                <w:szCs w:val="24"/>
-              </w:rPr>
-              <w:t>* - candidate default, U - per-user static route, o - ODR</w:t>
-            </w:r>
-          </w:p>
-          <w:p>
-            <w:pPr>
-              <w:rPr>
-                <w:rFonts w:ascii="Monospace" w:hAnsi="Monospace"/>
-                <w:sz w:val="20"/>
-                <w:szCs w:val="24"/>
-              </w:rPr>
-            </w:pPr>
-            <w:r>
-              <w:rPr>
-                <w:rFonts w:ascii="Monospace" w:hAnsi="Monospace"/>
-                <w:sz w:val="20"/>
-                <w:szCs w:val="24"/>
-              </w:rPr>
-              <w:t xml:space="preserve">    </w:t>
-            </w:r>
-            <w:r>
-              <w:rPr>
-                <w:rFonts w:ascii="Monospace" w:hAnsi="Monospace"/>
-                <w:sz w:val="20"/>
-                <w:szCs w:val="24"/>
-              </w:rPr>
-              <w:t>P - periodic downloaded static route</w:t>
-            </w:r>
-          </w:p>
-          <w:p>
-            <w:pPr>
-              <w:rPr>
-                <w:rFonts w:ascii="Monospace" w:hAnsi="Monospace"/>
-                <w:sz w:val="20"/>
-                <w:szCs w:val="24"/>
-              </w:rPr>
-            </w:pPr>
-            <w:r>
-              <w:rPr>
-                <w:rFonts w:ascii="Monospace" w:hAnsi="Monospace"/>
-                <w:sz w:val="20"/>
-                <w:szCs w:val="24"/>
-              </w:rPr>
-              <w:t xml:space="preserve">    </w:t>
-            </w:r>
-            <w:r>
-              <w:rPr>
-                <w:rFonts w:ascii="Monospace" w:hAnsi="Monospace"/>
-                <w:sz w:val="20"/>
-                <w:szCs w:val="24"/>
-              </w:rPr>
-              <w:t>Gateway of last resort is not set</w:t>
-            </w:r>
-          </w:p>
-          <w:p>
-            <w:pPr>
-              <w:rPr>
-                <w:rFonts w:ascii="Monospace" w:hAnsi="Monospace"/>
-                <w:sz w:val="20"/>
-                <w:szCs w:val="24"/>
-              </w:rPr>
-            </w:pPr>
-            <w:r>
-              <w:rPr>
-                <w:rFonts w:ascii="Monospace" w:hAnsi="Monospace"/>
-                <w:sz w:val="20"/>
-                <w:szCs w:val="24"/>
-              </w:rPr>
-              <w:t xml:space="preserve">    </w:t>
-            </w:r>
-            <w:r>
-              <w:rPr>
-                <w:rFonts w:ascii="Monospace" w:hAnsi="Monospace"/>
-                <w:sz w:val="20"/>
-                <w:szCs w:val="24"/>
-              </w:rPr>
-              <w:t xml:space="preserve">20.0.0.0/24 is </w:t>
-            </w:r>
-            <w:proofErr w:type="spellStart"/>
-            <w:r>
-              <w:rPr>
-                <w:rFonts w:ascii="Monospace" w:hAnsi="Monospace"/>
-                <w:sz w:val="20"/>
-                <w:szCs w:val="24"/>
-              </w:rPr>
-              <w:t>subnetted</w:t>
-            </w:r>
-            <w:proofErr w:type="spellEnd"/>
-            <w:r>
-              <w:rPr>
-                <w:rFonts w:ascii="Monospace" w:hAnsi="Monospace"/>
-                <w:sz w:val="20"/>
-                <w:szCs w:val="24"/>
-              </w:rPr>
-              <w:t xml:space="preserve">, 1 </w:t>
-            </w:r>
-            <w:proofErr w:type="gramStart"/>
-            <w:r>
-              <w:rPr>
-                <w:rFonts w:ascii="Monospace" w:hAnsi="Monospace"/>
-                <w:sz w:val="20"/>
-                <w:szCs w:val="24"/>
-              </w:rPr>
-              <w:t>subnets</w:t>
-            </w:r>
-            <w:proofErr w:type="gramEnd"/>
-          </w:p>
-          <w:p>
-            <w:pPr>
-              <w:rPr>
-                <w:rFonts w:ascii="Monospace" w:hAnsi="Monospace"/>
-                <w:sz w:val="20"/>
-                <w:szCs w:val="24"/>
-              </w:rPr>
-            </w:pPr>
-            <w:r>
-              <w:rPr>
-                <w:rFonts w:ascii="Monospace" w:hAnsi="Monospace"/>
-                <w:sz w:val="20"/>
-                <w:szCs w:val="24"/>
-              </w:rPr>
-              <w:t xml:space="preserve">    </w:t>
-            </w:r>
-            <w:r>
-              <w:rPr>
-                <w:rFonts w:ascii="Monospace" w:hAnsi="Monospace"/>
-                <w:sz w:val="20"/>
-                <w:szCs w:val="24"/>
-              </w:rPr>
-              <w:t>C 20.20.20.0 is directly connected, FastEthernet0/0</w:t>
-            </w:r>
-          </w:p>
-          <w:p>
-            <w:pPr>
-              <w:rPr>
-                <w:rFonts w:ascii="Monospace" w:hAnsi="Monospace"/>
-                <w:sz w:val="20"/>
-                <w:szCs w:val="24"/>
-              </w:rPr>
-            </w:pPr>
-            <w:r>
-              <w:rPr>
-                <w:rFonts w:ascii="Monospace" w:hAnsi="Monospace"/>
-                <w:sz w:val="20"/>
-                <w:szCs w:val="24"/>
-              </w:rPr>
-              <w:t xml:space="preserve">    </w:t>
-            </w:r>
-            <w:r>
-              <w:rPr>
-                <w:rFonts w:ascii="Monospace" w:hAnsi="Monospace"/>
-                <w:sz w:val="20"/>
-                <w:szCs w:val="24"/>
-              </w:rPr>
-              <w:t>S 50.0.0.0/8 [1/0] via 192.162.10.1</w:t>
-            </w:r>
-          </w:p>
-          <w:p>
-            <w:r>
-              <w:rPr>
-                <w:rFonts w:ascii="Monospace" w:hAnsi="Monospace"/>
-                <w:sz w:val="20"/>
-                <w:szCs w:val="24"/>
-              </w:rPr>
-              <w:t xml:space="preserve">    </w:t>
-            </w:r>
-            <w:r>
-              <w:rPr>
-                <w:rFonts w:ascii="Monospace" w:hAnsi="Monospace"/>
-                <w:sz w:val="20"/>
-                <w:szCs w:val="24"/>
-              </w:rPr>
-              <w:t>C 192.162.10.0/24 is directly connected, Serial2/0</w:t>
-            </w:r>
-          </w:p>
-        </w:tc>
-      </w:tr>
-    </w:tbl>
-    <w:p/>
     <w:sectPr>
       <w:pgSz w:w="11906" w:h="16838"/>
       <w:pgMar w:top="1440" w:right="1440" w:bottom="1440" w:left="1440" w:header="708" w:footer="708" w:gutter="0"/>
@@ -1176,15 +401,15 @@
       <w:rPr>
         <w:rFonts w:asciiTheme="minorHAnsi" w:eastAsiaTheme="minorHAnsi" w:hAnsiTheme="minorHAnsi" w:cstheme="minorBidi"/>
         <w:kern w:val="2"/>
-        <w:sz w:val="22"/>
-        <w:szCs w:val="28"/>
-        <w:lang w:val="en-IN" w:eastAsia="en-US" w:bidi="th-TH"/>
+        <w:sz w:val="24"/>
+        <w:szCs w:val="24"/>
+        <w:lang w:val="en-IN" w:eastAsia="en-US" w:bidi="ar-SA"/>
         <w14:ligatures w14:val="standardContextual"/>
       </w:rPr>
     </w:rPrDefault>
     <w:pPrDefault>
       <w:pPr>
-        <w:spacing w:after="160" w:line="259" w:lineRule="auto"/>
+        <w:spacing w:after="160" w:line="278" w:lineRule="auto"/>
       </w:pPr>
     </w:pPrDefault>
   </w:docDefaults>
@@ -1577,7 +802,7 @@
     <w:link w:val="Heading1Char"/>
     <w:uiPriority w:val="9"/>
     <w:qFormat/>
-    <w:rsid w:val="000707D5"/>
+    <w:rsid w:val="005D62B2"/>
     <w:pPr>
       <w:keepNext/>
       <w:keepLines/>
@@ -1588,7 +813,7 @@
       <w:rFonts w:asciiTheme="majorHAnsi" w:eastAsiaTheme="majorEastAsia" w:hAnsiTheme="majorHAnsi" w:cstheme="majorBidi"/>
       <w:color w:val="2F5496" w:themeColor="accent1" w:themeShade="BF"/>
       <w:sz w:val="40"/>
-      <w:szCs w:val="50"/>
+      <w:szCs w:val="40"/>
     </w:rPr>
   </w:style>
   <w:style w:type="paragraph" w:styleId="Heading2">
@@ -1600,7 +825,7 @@
     <w:semiHidden/>
     <w:unhideWhenUsed/>
     <w:qFormat/>
-    <w:rsid w:val="000707D5"/>
+    <w:rsid w:val="005D62B2"/>
     <w:pPr>
       <w:keepNext/>
       <w:keepLines/>
@@ -1611,7 +836,7 @@
       <w:rFonts w:asciiTheme="majorHAnsi" w:eastAsiaTheme="majorEastAsia" w:hAnsiTheme="majorHAnsi" w:cstheme="majorBidi"/>
       <w:color w:val="2F5496" w:themeColor="accent1" w:themeShade="BF"/>
       <w:sz w:val="32"/>
-      <w:szCs w:val="40"/>
+      <w:szCs w:val="32"/>
     </w:rPr>
   </w:style>
   <w:style w:type="paragraph" w:styleId="Heading3">
@@ -1623,7 +848,7 @@
     <w:semiHidden/>
     <w:unhideWhenUsed/>
     <w:qFormat/>
-    <w:rsid w:val="000707D5"/>
+    <w:rsid w:val="005D62B2"/>
     <w:pPr>
       <w:keepNext/>
       <w:keepLines/>
@@ -1634,7 +859,7 @@
       <w:rFonts w:eastAsiaTheme="majorEastAsia" w:cstheme="majorBidi"/>
       <w:color w:val="2F5496" w:themeColor="accent1" w:themeShade="BF"/>
       <w:sz w:val="28"/>
-      <w:szCs w:val="35"/>
+      <w:szCs w:val="28"/>
     </w:rPr>
   </w:style>
   <w:style w:type="paragraph" w:styleId="Heading4">
@@ -1646,7 +871,7 @@
     <w:semiHidden/>
     <w:unhideWhenUsed/>
     <w:qFormat/>
-    <w:rsid w:val="000707D5"/>
+    <w:rsid w:val="005D62B2"/>
     <w:pPr>
       <w:keepNext/>
       <w:keepLines/>
@@ -1669,7 +894,7 @@
     <w:semiHidden/>
     <w:unhideWhenUsed/>
     <w:qFormat/>
-    <w:rsid w:val="000707D5"/>
+    <w:rsid w:val="005D62B2"/>
     <w:pPr>
       <w:keepNext/>
       <w:keepLines/>
@@ -1690,7 +915,7 @@
     <w:semiHidden/>
     <w:unhideWhenUsed/>
     <w:qFormat/>
-    <w:rsid w:val="000707D5"/>
+    <w:rsid w:val="005D62B2"/>
     <w:pPr>
       <w:keepNext/>
       <w:keepLines/>
@@ -1713,7 +938,7 @@
     <w:semiHidden/>
     <w:unhideWhenUsed/>
     <w:qFormat/>
-    <w:rsid w:val="000707D5"/>
+    <w:rsid w:val="005D62B2"/>
     <w:pPr>
       <w:keepNext/>
       <w:keepLines/>
@@ -1734,7 +959,7 @@
     <w:semiHidden/>
     <w:unhideWhenUsed/>
     <w:qFormat/>
-    <w:rsid w:val="000707D5"/>
+    <w:rsid w:val="005D62B2"/>
     <w:pPr>
       <w:keepNext/>
       <w:keepLines/>
@@ -1757,7 +982,7 @@
     <w:semiHidden/>
     <w:unhideWhenUsed/>
     <w:qFormat/>
-    <w:rsid w:val="000707D5"/>
+    <w:rsid w:val="005D62B2"/>
     <w:pPr>
       <w:keepNext/>
       <w:keepLines/>
@@ -1772,6 +997,7 @@
   <w:style w:type="character" w:default="1" w:styleId="DefaultParagraphFont">
     <w:name w:val="Default Paragraph Font"/>
     <w:uiPriority w:val="1"/>
+    <w:semiHidden/>
     <w:unhideWhenUsed/>
   </w:style>
   <w:style w:type="table" w:default="1" w:styleId="TableNormal">
@@ -1800,12 +1026,12 @@
     <w:basedOn w:val="DefaultParagraphFont"/>
     <w:link w:val="Heading1"/>
     <w:uiPriority w:val="9"/>
-    <w:rsid w:val="000707D5"/>
+    <w:rsid w:val="005D62B2"/>
     <w:rPr>
       <w:rFonts w:asciiTheme="majorHAnsi" w:eastAsiaTheme="majorEastAsia" w:hAnsiTheme="majorHAnsi" w:cstheme="majorBidi"/>
       <w:color w:val="2F5496" w:themeColor="accent1" w:themeShade="BF"/>
       <w:sz w:val="40"/>
-      <w:szCs w:val="50"/>
+      <w:szCs w:val="40"/>
     </w:rPr>
   </w:style>
   <w:style w:type="character" w:customStyle="1" w:styleId="Heading2Char">
@@ -1814,12 +1040,12 @@
     <w:link w:val="Heading2"/>
     <w:uiPriority w:val="9"/>
     <w:semiHidden/>
-    <w:rsid w:val="000707D5"/>
+    <w:rsid w:val="005D62B2"/>
     <w:rPr>
       <w:rFonts w:asciiTheme="majorHAnsi" w:eastAsiaTheme="majorEastAsia" w:hAnsiTheme="majorHAnsi" w:cstheme="majorBidi"/>
       <w:color w:val="2F5496" w:themeColor="accent1" w:themeShade="BF"/>
       <w:sz w:val="32"/>
-      <w:szCs w:val="40"/>
+      <w:szCs w:val="32"/>
     </w:rPr>
   </w:style>
   <w:style w:type="character" w:customStyle="1" w:styleId="Heading3Char">
@@ -1828,12 +1054,12 @@
     <w:link w:val="Heading3"/>
     <w:uiPriority w:val="9"/>
     <w:semiHidden/>
-    <w:rsid w:val="000707D5"/>
+    <w:rsid w:val="005D62B2"/>
     <w:rPr>
       <w:rFonts w:eastAsiaTheme="majorEastAsia" w:cstheme="majorBidi"/>
       <w:color w:val="2F5496" w:themeColor="accent1" w:themeShade="BF"/>
       <w:sz w:val="28"/>
-      <w:szCs w:val="35"/>
+      <w:szCs w:val="28"/>
     </w:rPr>
   </w:style>
   <w:style w:type="character" w:customStyle="1" w:styleId="Heading4Char">
@@ -1842,7 +1068,7 @@
     <w:link w:val="Heading4"/>
     <w:uiPriority w:val="9"/>
     <w:semiHidden/>
-    <w:rsid w:val="000707D5"/>
+    <w:rsid w:val="005D62B2"/>
     <w:rPr>
       <w:rFonts w:eastAsiaTheme="majorEastAsia" w:cstheme="majorBidi"/>
       <w:i/>
@@ -1856,7 +1082,7 @@
     <w:link w:val="Heading5"/>
     <w:uiPriority w:val="9"/>
     <w:semiHidden/>
-    <w:rsid w:val="000707D5"/>
+    <w:rsid w:val="005D62B2"/>
     <w:rPr>
       <w:rFonts w:eastAsiaTheme="majorEastAsia" w:cstheme="majorBidi"/>
       <w:color w:val="2F5496" w:themeColor="accent1" w:themeShade="BF"/>
@@ -1868,7 +1094,7 @@
     <w:link w:val="Heading6"/>
     <w:uiPriority w:val="9"/>
     <w:semiHidden/>
-    <w:rsid w:val="000707D5"/>
+    <w:rsid w:val="005D62B2"/>
     <w:rPr>
       <w:rFonts w:eastAsiaTheme="majorEastAsia" w:cstheme="majorBidi"/>
       <w:i/>
@@ -1882,7 +1108,7 @@
     <w:link w:val="Heading7"/>
     <w:uiPriority w:val="9"/>
     <w:semiHidden/>
-    <w:rsid w:val="000707D5"/>
+    <w:rsid w:val="005D62B2"/>
     <w:rPr>
       <w:rFonts w:eastAsiaTheme="majorEastAsia" w:cstheme="majorBidi"/>
       <w:color w:val="595959" w:themeColor="text1" w:themeTint="A6"/>
@@ -1894,7 +1120,7 @@
     <w:link w:val="Heading8"/>
     <w:uiPriority w:val="9"/>
     <w:semiHidden/>
-    <w:rsid w:val="000707D5"/>
+    <w:rsid w:val="005D62B2"/>
     <w:rPr>
       <w:rFonts w:eastAsiaTheme="majorEastAsia" w:cstheme="majorBidi"/>
       <w:i/>
@@ -1908,7 +1134,7 @@
     <w:link w:val="Heading9"/>
     <w:uiPriority w:val="9"/>
     <w:semiHidden/>
-    <w:rsid w:val="000707D5"/>
+    <w:rsid w:val="005D62B2"/>
     <w:rPr>
       <w:rFonts w:eastAsiaTheme="majorEastAsia" w:cstheme="majorBidi"/>
       <w:color w:val="272727" w:themeColor="text1" w:themeTint="D8"/>
@@ -1921,7 +1147,7 @@
     <w:link w:val="TitleChar"/>
     <w:uiPriority w:val="10"/>
     <w:qFormat/>
-    <w:rsid w:val="000707D5"/>
+    <w:rsid w:val="005D62B2"/>
     <w:pPr>
       <w:spacing w:after="80" w:line="240" w:lineRule="auto"/>
       <w:contextualSpacing/>
@@ -1931,7 +1157,7 @@
       <w:spacing w:val="-10"/>
       <w:kern w:val="28"/>
       <w:sz w:val="56"/>
-      <w:szCs w:val="71"/>
+      <w:szCs w:val="56"/>
     </w:rPr>
   </w:style>
   <w:style w:type="character" w:customStyle="1" w:styleId="TitleChar">
@@ -1939,13 +1165,13 @@
     <w:basedOn w:val="DefaultParagraphFont"/>
     <w:link w:val="Title"/>
     <w:uiPriority w:val="10"/>
-    <w:rsid w:val="000707D5"/>
+    <w:rsid w:val="005D62B2"/>
     <w:rPr>
       <w:rFonts w:asciiTheme="majorHAnsi" w:eastAsiaTheme="majorEastAsia" w:hAnsiTheme="majorHAnsi" w:cstheme="majorBidi"/>
       <w:spacing w:val="-10"/>
       <w:kern w:val="28"/>
       <w:sz w:val="56"/>
-      <w:szCs w:val="71"/>
+      <w:szCs w:val="56"/>
     </w:rPr>
   </w:style>
   <w:style w:type="paragraph" w:styleId="Subtitle">
@@ -1955,7 +1181,7 @@
     <w:link w:val="SubtitleChar"/>
     <w:uiPriority w:val="11"/>
     <w:qFormat/>
-    <w:rsid w:val="000707D5"/>
+    <w:rsid w:val="005D62B2"/>
     <w:pPr>
       <w:numPr>
         <w:ilvl w:val="1"/>
@@ -1966,7 +1192,7 @@
       <w:color w:val="595959" w:themeColor="text1" w:themeTint="A6"/>
       <w:spacing w:val="15"/>
       <w:sz w:val="28"/>
-      <w:szCs w:val="35"/>
+      <w:szCs w:val="28"/>
     </w:rPr>
   </w:style>
   <w:style w:type="character" w:customStyle="1" w:styleId="SubtitleChar">
@@ -1974,13 +1200,13 @@
     <w:basedOn w:val="DefaultParagraphFont"/>
     <w:link w:val="Subtitle"/>
     <w:uiPriority w:val="11"/>
-    <w:rsid w:val="000707D5"/>
+    <w:rsid w:val="005D62B2"/>
     <w:rPr>
       <w:rFonts w:eastAsiaTheme="majorEastAsia" w:cstheme="majorBidi"/>
       <w:color w:val="595959" w:themeColor="text1" w:themeTint="A6"/>
       <w:spacing w:val="15"/>
       <w:sz w:val="28"/>
-      <w:szCs w:val="35"/>
+      <w:szCs w:val="28"/>
     </w:rPr>
   </w:style>
   <w:style w:type="paragraph" w:styleId="Quote">
@@ -1990,7 +1216,7 @@
     <w:link w:val="QuoteChar"/>
     <w:uiPriority w:val="29"/>
     <w:qFormat/>
-    <w:rsid w:val="000707D5"/>
+    <w:rsid w:val="005D62B2"/>
     <w:pPr>
       <w:spacing w:before="160"/>
       <w:jc w:val="center"/>
@@ -2006,7 +1232,7 @@
     <w:basedOn w:val="DefaultParagraphFont"/>
     <w:link w:val="Quote"/>
     <w:uiPriority w:val="29"/>
-    <w:rsid w:val="000707D5"/>
+    <w:rsid w:val="005D62B2"/>
     <w:rPr>
       <w:i/>
       <w:iCs/>
@@ -2018,7 +1244,7 @@
     <w:basedOn w:val="Normal"/>
     <w:uiPriority w:val="34"/>
     <w:qFormat/>
-    <w:rsid w:val="000707D5"/>
+    <w:rsid w:val="005D62B2"/>
     <w:pPr>
       <w:ind w:left="720"/>
       <w:contextualSpacing/>
@@ -2029,7 +1255,7 @@
     <w:basedOn w:val="DefaultParagraphFont"/>
     <w:uiPriority w:val="21"/>
     <w:qFormat/>
-    <w:rsid w:val="000707D5"/>
+    <w:rsid w:val="005D62B2"/>
     <w:rPr>
       <w:i/>
       <w:iCs/>
@@ -2043,7 +1269,7 @@
     <w:link w:val="IntenseQuoteChar"/>
     <w:uiPriority w:val="30"/>
     <w:qFormat/>
-    <w:rsid w:val="000707D5"/>
+    <w:rsid w:val="005D62B2"/>
     <w:pPr>
       <w:pBdr>
         <w:top w:val="single" w:sz="4" w:space="10" w:color="2F5496" w:themeColor="accent1" w:themeShade="BF"/>
@@ -2064,7 +1290,7 @@
     <w:basedOn w:val="DefaultParagraphFont"/>
     <w:link w:val="IntenseQuote"/>
     <w:uiPriority w:val="30"/>
-    <w:rsid w:val="000707D5"/>
+    <w:rsid w:val="005D62B2"/>
     <w:rPr>
       <w:i/>
       <w:iCs/>
@@ -2076,7 +1302,7 @@
     <w:basedOn w:val="DefaultParagraphFont"/>
     <w:uiPriority w:val="32"/>
     <w:qFormat/>
-    <w:rsid w:val="000707D5"/>
+    <w:rsid w:val="005D62B2"/>
     <w:rPr>
       <w:b/>
       <w:bCs/>
@@ -2084,25 +1310,6 @@
       <w:color w:val="2F5496" w:themeColor="accent1" w:themeShade="BF"/>
       <w:spacing w:val="5"/>
     </w:rPr>
-  </w:style>
-  <w:style w:type="table" w:styleId="TableGrid">
-    <w:name w:val="Table Grid"/>
-    <w:basedOn w:val="TableNormal"/>
-    <w:uiPriority w:val="39"/>
-    <w:rsid w:val="00F51BB9"/>
-    <w:pPr>
-      <w:spacing w:after="0" w:line="240" w:lineRule="auto"/>
-    </w:pPr>
-    <w:tblPr>
-      <w:tblBorders>
-        <w:top w:val="single" w:sz="4" w:space="0" w:color="auto"/>
-        <w:left w:val="single" w:sz="4" w:space="0" w:color="auto"/>
-        <w:bottom w:val="single" w:sz="4" w:space="0" w:color="auto"/>
-        <w:right w:val="single" w:sz="4" w:space="0" w:color="auto"/>
-        <w:insideH w:val="single" w:sz="4" w:space="0" w:color="auto"/>
-        <w:insideV w:val="single" w:sz="4" w:space="0" w:color="auto"/>
-      </w:tblBorders>
-    </w:tblPr>
   </w:style>
 </w:styles>
 </file>

</xml_diff>